<commit_message>
feat: complete Phase 7 WeChat login integration and team betting challenge settlement engine
</commit_message>
<xml_diff>
--- a/文档/04_运营与冷启动/04_冷启动与商业变现方案.docx
+++ b/文档/04_运营与冷启动/04_冷启动与商业变现方案.docx
@@ -5,12 +5,22 @@
     <w:p>
       <w:pPr>
         <w:pStyle w:val="Heading1"/>
+        <w:keepNext/>
+        <w:spacing w:before="240" w:after="120"/>
       </w:pPr>
       <w:r>
         <w:rPr>
           <w:rFonts w:ascii="Microsoft YaHei" w:hAnsi="Microsoft YaHei"/>
           <w:b/>
-          <w:color w:val="10B981"/>
+          <w:color w:val="1F4E79"/>
+          <w:sz w:val="36"/>
+        </w:rPr>
+      </w:r>
+      <w:r>
+        <w:rPr>
+          <w:rFonts w:ascii="Microsoft YaHei" w:hAnsi="Microsoft YaHei"/>
+          <w:b/>
+          <w:color w:val="1F4E79"/>
           <w:sz w:val="36"/>
         </w:rPr>
         <w:t>食刻 (ShiKe) — 冷启动与商业变现方案</w:t>
@@ -19,62 +29,127 @@
     <w:p>
       <w:pPr>
         <w:pStyle w:val="Heading2"/>
+        <w:keepNext/>
+        <w:spacing w:before="240" w:after="120"/>
       </w:pPr>
       <w:r>
         <w:rPr>
           <w:rFonts w:ascii="Microsoft YaHei" w:hAnsi="Microsoft YaHei"/>
           <w:b/>
-          <w:color w:val="6366F1"/>
+          <w:color w:val="2E74B5"/>
+          <w:sz w:val="28"/>
+        </w:rPr>
+      </w:r>
+      <w:r>
+        <w:rPr>
+          <w:rFonts w:ascii="Microsoft YaHei" w:hAnsi="Microsoft YaHei"/>
+          <w:b/>
+          <w:color w:val="2E74B5"/>
           <w:sz w:val="28"/>
         </w:rPr>
         <w:t>运营与商业化白皮书 (v1.0)</w:t>
       </w:r>
     </w:p>
     <w:p>
+      <w:pPr>
+        <w:spacing w:before="120" w:after="120"/>
+      </w:pPr>
       <w:r>
         <w:rPr>
-          <w:rFonts w:ascii="Microsoft YaHei" w:hAnsi="Microsoft YaHei"/>
+          <w:color w:val="B4B4B4"/>
         </w:rPr>
-        <w:t>---</w:t>
+        <w:t>——————————————————————————————————————————————————</w:t>
       </w:r>
     </w:p>
     <w:p>
       <w:pPr>
         <w:pStyle w:val="Heading3"/>
+        <w:keepNext/>
+        <w:spacing w:before="240" w:after="120"/>
       </w:pPr>
       <w:r>
         <w:rPr>
           <w:rFonts w:ascii="Microsoft YaHei" w:hAnsi="Microsoft YaHei"/>
           <w:b/>
-          <w:color w:val="1E293B"/>
+          <w:color w:val="595959"/>
+          <w:sz w:val="24"/>
+        </w:rPr>
+      </w:r>
+      <w:r>
+        <w:rPr>
+          <w:rFonts w:ascii="Microsoft YaHei" w:hAnsi="Microsoft YaHei"/>
+          <w:b/>
+          <w:color w:val="595959"/>
           <w:sz w:val="24"/>
         </w:rPr>
         <w:t>一、 0 预算冷启动与用户增长策略</w:t>
       </w:r>
     </w:p>
     <w:p>
+      <w:pPr>
+        <w:spacing w:after="120" w:line="276" w:lineRule="auto"/>
+      </w:pPr>
       <w:r>
         <w:rPr>
           <w:rFonts w:ascii="Microsoft YaHei" w:hAnsi="Microsoft YaHei"/>
         </w:rPr>
-        <w:t>独立开发者的核心瓶颈是“无买量预算”。食刻通过 “Build in Public（公开构建）” 和 “私密社交自裂变” 双引擎驱动，实现 0 预算破局。</w:t>
+        <w:t xml:space="preserve">独立开发者的核心瓶颈是“无买量预算”。食刻通过 </w:t>
+      </w:r>
+      <w:r>
+        <w:rPr>
+          <w:rFonts w:ascii="Microsoft YaHei" w:hAnsi="Microsoft YaHei"/>
+          <w:b/>
+        </w:rPr>
+        <w:t>“Build in Public（公开构建）”</w:t>
+      </w:r>
+      <w:r>
+        <w:rPr>
+          <w:rFonts w:ascii="Microsoft YaHei" w:hAnsi="Microsoft YaHei"/>
+        </w:rPr>
+        <w:t xml:space="preserve"> 和 </w:t>
+      </w:r>
+      <w:r>
+        <w:rPr>
+          <w:rFonts w:ascii="Microsoft YaHei" w:hAnsi="Microsoft YaHei"/>
+          <w:b/>
+        </w:rPr>
+        <w:t>“私密社交自裂变”</w:t>
+      </w:r>
+      <w:r>
+        <w:rPr>
+          <w:rFonts w:ascii="Microsoft YaHei" w:hAnsi="Microsoft YaHei"/>
+        </w:rPr>
+        <w:t xml:space="preserve"> 双引擎驱动，实现 0 预算破局。</w:t>
       </w:r>
     </w:p>
     <w:p>
       <w:pPr>
         <w:pStyle w:val="Heading4"/>
+        <w:keepNext/>
+        <w:spacing w:before="240" w:after="120"/>
       </w:pPr>
       <w:r>
         <w:rPr>
           <w:rFonts w:ascii="Microsoft YaHei" w:hAnsi="Microsoft YaHei"/>
           <w:b/>
-          <w:color w:val="475569"/>
-          <w:sz w:val="22"/>
+          <w:color w:val="595959"/>
+          <w:sz w:val="24"/>
+        </w:rPr>
+      </w:r>
+      <w:r>
+        <w:rPr>
+          <w:rFonts w:ascii="Microsoft YaHei" w:hAnsi="Microsoft YaHei"/>
+          <w:b/>
+          <w:color w:val="595959"/>
+          <w:sz w:val="24"/>
         </w:rPr>
         <w:t>1. Build in Public (公开构建) 实操手册</w:t>
       </w:r>
     </w:p>
     <w:p>
+      <w:pPr>
+        <w:spacing w:after="120" w:line="276" w:lineRule="auto"/>
+      </w:pPr>
       <w:r>
         <w:rPr>
           <w:rFonts w:ascii="Microsoft YaHei" w:hAnsi="Microsoft YaHei"/>
@@ -85,84 +160,127 @@
     <w:p>
       <w:pPr>
         <w:pStyle w:val="ListBullet"/>
+        <w:spacing w:after="60"/>
       </w:pPr>
       <w:r>
         <w:rPr>
           <w:rFonts w:ascii="Microsoft YaHei" w:hAnsi="Microsoft YaHei"/>
         </w:rPr>
-        <w:t xml:space="preserve">  小红书平台设计（主攻大众减脂群体）：</w:t>
+      </w:r>
+      <w:r>
+        <w:rPr>
+          <w:rFonts w:ascii="Microsoft YaHei" w:hAnsi="Microsoft YaHei"/>
+          <w:b/>
+        </w:rPr>
+        <w:t>小红书平台设计（主攻大众减脂群体）</w:t>
+      </w:r>
+      <w:r>
+        <w:rPr>
+          <w:rFonts w:ascii="Microsoft YaHei" w:hAnsi="Microsoft YaHei"/>
+        </w:rPr>
+        <w:t>：</w:t>
       </w:r>
     </w:p>
     <w:p>
       <w:pPr>
         <w:pStyle w:val="ListBullet"/>
+        <w:spacing w:after="60"/>
       </w:pPr>
       <w:r>
         <w:rPr>
           <w:rFonts w:ascii="Microsoft YaHei" w:hAnsi="Microsoft YaHei"/>
         </w:rPr>
-        <w:t xml:space="preserve">  选题方向：痛点吐槽 + 独立日记。如《别再逼我称重了！我用 AI 撸了个拍照算卡路里的小程序》。</w:t>
+        <w:t>*选题方向*：痛点吐槽 + 独立日记。如《别再逼我称重了！我用 AI 撸了个拍照算卡路里的小程序》。</w:t>
       </w:r>
     </w:p>
     <w:p>
       <w:pPr>
         <w:pStyle w:val="ListBullet"/>
+        <w:spacing w:after="60"/>
       </w:pPr>
       <w:r>
         <w:rPr>
           <w:rFonts w:ascii="Microsoft YaHei" w:hAnsi="Microsoft YaHei"/>
         </w:rPr>
-        <w:t xml:space="preserve">  视觉图设计：左侧放传统APP输入100g红烧肉的痛苦截图，右侧放食刻拍照秒出结果的精美UI卡片，形成强烈的对比对比。</w:t>
+        <w:t>*视觉图设计*：左侧放传统APP输入100g红烧肉的痛苦截图，右侧放食刻拍照秒出结果的精美UI卡片，形成强烈的对比对比。</w:t>
       </w:r>
     </w:p>
     <w:p>
       <w:pPr>
         <w:pStyle w:val="ListBullet"/>
+        <w:spacing w:after="60"/>
       </w:pPr>
       <w:r>
         <w:rPr>
           <w:rFonts w:ascii="Microsoft YaHei" w:hAnsi="Microsoft YaHei"/>
         </w:rPr>
-        <w:t xml:space="preserve">  即刻与 V2EX 平台设计（主攻极客与独立开发群）：</w:t>
+      </w:r>
+      <w:r>
+        <w:rPr>
+          <w:rFonts w:ascii="Microsoft YaHei" w:hAnsi="Microsoft YaHei"/>
+          <w:b/>
+        </w:rPr>
+        <w:t>即刻与 V2EX 平台设计（主攻极客与独立开发群）</w:t>
+      </w:r>
+      <w:r>
+        <w:rPr>
+          <w:rFonts w:ascii="Microsoft YaHei" w:hAnsi="Microsoft YaHei"/>
+        </w:rPr>
+        <w:t>：</w:t>
       </w:r>
     </w:p>
     <w:p>
       <w:pPr>
         <w:pStyle w:val="ListBullet"/>
+        <w:spacing w:after="60"/>
       </w:pPr>
       <w:r>
         <w:rPr>
           <w:rFonts w:ascii="Microsoft YaHei" w:hAnsi="Microsoft YaHei"/>
         </w:rPr>
-        <w:t xml:space="preserve">  选题方向：技术栈探索与商业实录。如《Java 后端 + AI 前端切图，我用两周开发完一款对赌打卡小程序》。</w:t>
+        <w:t>*选题方向*：技术栈探索与商业实录。如《Java 后端 + AI 前端切图，我用两周开发完一款对赌打卡小程序》。</w:t>
       </w:r>
     </w:p>
     <w:p>
       <w:pPr>
         <w:pStyle w:val="ListBullet"/>
+        <w:spacing w:after="60"/>
       </w:pPr>
       <w:r>
         <w:rPr>
           <w:rFonts w:ascii="Microsoft YaHei" w:hAnsi="Microsoft YaHei"/>
         </w:rPr>
-        <w:t xml:space="preserve">  目标：吸引第一批追求高自律、对科技敏感的早期种子用户。</w:t>
+        <w:t>*目标*：吸引第一批追求高自律、对科技敏感的早期种子用户。</w:t>
       </w:r>
     </w:p>
     <w:p>
       <w:pPr>
         <w:pStyle w:val="Heading4"/>
+        <w:keepNext/>
+        <w:spacing w:before="240" w:after="120"/>
       </w:pPr>
       <w:r>
         <w:rPr>
           <w:rFonts w:ascii="Microsoft YaHei" w:hAnsi="Microsoft YaHei"/>
           <w:b/>
-          <w:color w:val="475569"/>
-          <w:sz w:val="22"/>
+          <w:color w:val="595959"/>
+          <w:sz w:val="24"/>
+        </w:rPr>
+      </w:r>
+      <w:r>
+        <w:rPr>
+          <w:rFonts w:ascii="Microsoft YaHei" w:hAnsi="Microsoft YaHei"/>
+          <w:b/>
+          <w:color w:val="595959"/>
+          <w:sz w:val="24"/>
         </w:rPr>
         <w:t>2. 自裂变机制（K Factor &gt; 1 的闭环）</w:t>
       </w:r>
     </w:p>
     <w:p>
+      <w:pPr>
+        <w:spacing w:after="120" w:line="276" w:lineRule="auto"/>
+      </w:pPr>
       <w:r>
         <w:rPr>
           <w:rFonts w:ascii="Microsoft YaHei" w:hAnsi="Microsoft YaHei"/>
@@ -171,93 +289,199 @@
       </w:r>
     </w:p>
     <w:p>
+      <w:pPr>
+        <w:pStyle w:val="ListNumber"/>
+        <w:spacing w:after="60"/>
+      </w:pPr>
       <w:r>
         <w:rPr>
           <w:rFonts w:ascii="Microsoft YaHei" w:hAnsi="Microsoft YaHei"/>
         </w:rPr>
-        <w:t>1.  组队门槛：用户如果想要开启“对赌打卡”，必须满足 2 人及以上的组队要求。</w:t>
       </w:r>
-    </w:p>
-    <w:p>
+      <w:r>
+        <w:rPr>
+          <w:rFonts w:ascii="Microsoft YaHei" w:hAnsi="Microsoft YaHei"/>
+          <w:b/>
+        </w:rPr>
+        <w:t>组队门槛</w:t>
+      </w:r>
       <w:r>
         <w:rPr>
           <w:rFonts w:ascii="Microsoft YaHei" w:hAnsi="Microsoft YaHei"/>
         </w:rPr>
-        <w:t>2.  拉新诱导：创建小队的用户，一键点击“邀请队员”，生成精美的微信分享卡片（如：“我发起了7天减脂对赌，输了请喝美式！输入邀请码【A8X2B】加入战斗”）。</w:t>
+        <w:t>：用户如果想要开启“对赌打卡”，必须满足 2 人及以上的组队要求。</w:t>
       </w:r>
     </w:p>
     <w:p>
+      <w:pPr>
+        <w:pStyle w:val="ListNumber"/>
+        <w:spacing w:after="60"/>
+      </w:pPr>
       <w:r>
         <w:rPr>
           <w:rFonts w:ascii="Microsoft YaHei" w:hAnsi="Microsoft YaHei"/>
         </w:rPr>
-        <w:t>3.  熟人推荐：被邀请的队员为了不输掉面子或押金，会欣然加入，从而将拉新动作由“系统硬推广”变为“熟人间的游戏化邀约”。</w:t>
       </w:r>
-    </w:p>
-    <w:p>
+      <w:r>
+        <w:rPr>
+          <w:rFonts w:ascii="Microsoft YaHei" w:hAnsi="Microsoft YaHei"/>
+          <w:b/>
+        </w:rPr>
+        <w:t>拉新诱导</w:t>
+      </w:r>
       <w:r>
         <w:rPr>
           <w:rFonts w:ascii="Microsoft YaHei" w:hAnsi="Microsoft YaHei"/>
         </w:rPr>
-        <w:t>---</w:t>
+        <w:t>：创建小队的用户，一键点击“邀请队员”，生成精美的微信分享卡片（如：`“我发起了7天减脂对赌，输了请喝美式！输入邀请码【A8X2B】加入战斗”`）。</w:t>
+      </w:r>
+    </w:p>
+    <w:p>
+      <w:pPr>
+        <w:pStyle w:val="ListNumber"/>
+        <w:spacing w:after="60"/>
+      </w:pPr>
+      <w:r>
+        <w:rPr>
+          <w:rFonts w:ascii="Microsoft YaHei" w:hAnsi="Microsoft YaHei"/>
+        </w:rPr>
+      </w:r>
+      <w:r>
+        <w:rPr>
+          <w:rFonts w:ascii="Microsoft YaHei" w:hAnsi="Microsoft YaHei"/>
+          <w:b/>
+        </w:rPr>
+        <w:t>熟人推荐</w:t>
+      </w:r>
+      <w:r>
+        <w:rPr>
+          <w:rFonts w:ascii="Microsoft YaHei" w:hAnsi="Microsoft YaHei"/>
+        </w:rPr>
+        <w:t>：被邀请的队员为了不输掉面子或押金，会欣然加入，从而将拉新动作由“系统硬推广”变为“熟人间的游戏化邀约”。</w:t>
+      </w:r>
+    </w:p>
+    <w:p>
+      <w:pPr>
+        <w:spacing w:before="120" w:after="120"/>
+      </w:pPr>
+      <w:r>
+        <w:rPr>
+          <w:color w:val="B4B4B4"/>
+        </w:rPr>
+        <w:t>——————————————————————————————————————————————————</w:t>
       </w:r>
     </w:p>
     <w:p>
       <w:pPr>
         <w:pStyle w:val="Heading3"/>
+        <w:keepNext/>
+        <w:spacing w:before="240" w:after="120"/>
       </w:pPr>
       <w:r>
         <w:rPr>
           <w:rFonts w:ascii="Microsoft YaHei" w:hAnsi="Microsoft YaHei"/>
           <w:b/>
-          <w:color w:val="1E293B"/>
+          <w:color w:val="595959"/>
+          <w:sz w:val="24"/>
+        </w:rPr>
+      </w:r>
+      <w:r>
+        <w:rPr>
+          <w:rFonts w:ascii="Microsoft YaHei" w:hAnsi="Microsoft YaHei"/>
+          <w:b/>
+          <w:color w:val="595959"/>
           <w:sz w:val="24"/>
         </w:rPr>
         <w:t>二、 商业变现路径规划 (Monetization Roadmap)</w:t>
       </w:r>
     </w:p>
     <w:p>
+      <w:pPr>
+        <w:spacing w:after="120" w:line="276" w:lineRule="auto"/>
+      </w:pPr>
       <w:r>
         <w:rPr>
           <w:rFonts w:ascii="Microsoft YaHei" w:hAnsi="Microsoft YaHei"/>
         </w:rPr>
-        <w:t>变现逻辑的核心是：不收普通用户的功能使用费，而是通过“增值服务”、“内容集市抽佣”和“原生品牌带货”来盈利。</w:t>
+        <w:t>变现逻辑的核心是：</w:t>
+      </w:r>
+      <w:r>
+        <w:rPr>
+          <w:rFonts w:ascii="Microsoft YaHei" w:hAnsi="Microsoft YaHei"/>
+          <w:b/>
+        </w:rPr>
+        <w:t>不收普通用户的功能使用费，而是通过“增值服务”、“内容集市抽佣”和“原生品牌带货”来盈利。</w:t>
+      </w:r>
+      <w:r>
+        <w:rPr>
+          <w:rFonts w:ascii="Microsoft YaHei" w:hAnsi="Microsoft YaHei"/>
+        </w:rPr>
       </w:r>
     </w:p>
     <w:p>
       <w:pPr>
-        <w:ind w:left="720"/>
+        <w:spacing w:after="120" w:line="276" w:lineRule="auto"/>
       </w:pPr>
       <w:r>
         <w:rPr>
-          <w:rFonts w:ascii="Courier New" w:hAnsi="Courier New"/>
-          <w:sz w:val="19"/>
+          <w:rFonts w:ascii="Microsoft YaHei" w:hAnsi="Microsoft YaHei"/>
         </w:rPr>
-        <w:t xml:space="preserve"> [用户规模 &lt; 5000] ──&gt; [5000 - 5万用户] ──&gt; [用户规模 &gt; 5万]</w:t>
+        <w:t>```</w:t>
       </w:r>
     </w:p>
     <w:p>
       <w:pPr>
-        <w:ind w:left="720"/>
+        <w:spacing w:after="120" w:line="276" w:lineRule="auto"/>
       </w:pPr>
       <w:r>
         <w:rPr>
-          <w:rFonts w:ascii="Courier New" w:hAnsi="Courier New"/>
-          <w:sz w:val="19"/>
+          <w:rFonts w:ascii="Microsoft YaHei" w:hAnsi="Microsoft YaHei"/>
         </w:rPr>
-        <w:t xml:space="preserve">   (完全免费)             (食刻集市 20% 抽佣)        (订阅制会员 + 品牌合作)</w:t>
+        <w:t>[用户规模 &lt; 5000] ──&gt; [5000 - 5万用户] ──&gt; [用户规模 &gt; 5万]</w:t>
+      </w:r>
+    </w:p>
+    <w:p>
+      <w:pPr>
+        <w:spacing w:after="120" w:line="276" w:lineRule="auto"/>
+      </w:pPr>
+      <w:r>
+        <w:rPr>
+          <w:rFonts w:ascii="Microsoft YaHei" w:hAnsi="Microsoft YaHei"/>
+        </w:rPr>
+        <w:t>(完全免费)             (食刻集市 20% 抽佣)        (订阅制会员 + 品牌合作)</w:t>
+      </w:r>
+    </w:p>
+    <w:p>
+      <w:pPr>
+        <w:spacing w:after="120" w:line="276" w:lineRule="auto"/>
+      </w:pPr>
+      <w:r>
+        <w:rPr>
+          <w:rFonts w:ascii="Microsoft YaHei" w:hAnsi="Microsoft YaHei"/>
+        </w:rPr>
+        <w:t>```</w:t>
       </w:r>
     </w:p>
     <w:p>
       <w:pPr>
         <w:pStyle w:val="Heading4"/>
+        <w:keepNext/>
+        <w:spacing w:before="240" w:after="120"/>
       </w:pPr>
       <w:r>
         <w:rPr>
           <w:rFonts w:ascii="Microsoft YaHei" w:hAnsi="Microsoft YaHei"/>
           <w:b/>
-          <w:color w:val="475569"/>
-          <w:sz w:val="22"/>
+          <w:color w:val="595959"/>
+          <w:sz w:val="24"/>
+        </w:rPr>
+      </w:r>
+      <w:r>
+        <w:rPr>
+          <w:rFonts w:ascii="Microsoft YaHei" w:hAnsi="Microsoft YaHei"/>
+          <w:b/>
+          <w:color w:val="595959"/>
+          <w:sz w:val="24"/>
         </w:rPr>
         <w:t>1. 启动期（用户数 &lt; 5,000）</w:t>
       </w:r>
@@ -265,35 +489,71 @@
     <w:p>
       <w:pPr>
         <w:pStyle w:val="ListBullet"/>
+        <w:spacing w:after="60"/>
       </w:pPr>
       <w:r>
         <w:rPr>
           <w:rFonts w:ascii="Microsoft YaHei" w:hAnsi="Microsoft YaHei"/>
         </w:rPr>
-        <w:t xml:space="preserve">  动作：全功能免费，且不加入任何弹窗广告。</w:t>
+      </w:r>
+      <w:r>
+        <w:rPr>
+          <w:rFonts w:ascii="Microsoft YaHei" w:hAnsi="Microsoft YaHei"/>
+          <w:b/>
+        </w:rPr>
+        <w:t>动作</w:t>
+      </w:r>
+      <w:r>
+        <w:rPr>
+          <w:rFonts w:ascii="Microsoft YaHei" w:hAnsi="Microsoft YaHei"/>
+        </w:rPr>
+        <w:t>：全功能免费，且不加入任何弹窗广告。</w:t>
       </w:r>
     </w:p>
     <w:p>
       <w:pPr>
         <w:pStyle w:val="ListBullet"/>
+        <w:spacing w:after="60"/>
       </w:pPr>
       <w:r>
         <w:rPr>
           <w:rFonts w:ascii="Microsoft YaHei" w:hAnsi="Microsoft YaHei"/>
         </w:rPr>
-        <w:t xml:space="preserve">  目的：积累数据，不断优化 AI 视觉 Prompt，打磨体验，建立品牌口碑。</w:t>
+      </w:r>
+      <w:r>
+        <w:rPr>
+          <w:rFonts w:ascii="Microsoft YaHei" w:hAnsi="Microsoft YaHei"/>
+          <w:b/>
+        </w:rPr>
+        <w:t>目的</w:t>
+      </w:r>
+      <w:r>
+        <w:rPr>
+          <w:rFonts w:ascii="Microsoft YaHei" w:hAnsi="Microsoft YaHei"/>
+        </w:rPr>
+        <w:t>：积累数据，不断优化 AI 视觉 Prompt，打磨体验，建立品牌口碑。</w:t>
       </w:r>
     </w:p>
     <w:p>
       <w:pPr>
         <w:pStyle w:val="Heading4"/>
+        <w:keepNext/>
+        <w:spacing w:before="240" w:after="120"/>
       </w:pPr>
       <w:r>
         <w:rPr>
           <w:rFonts w:ascii="Microsoft YaHei" w:hAnsi="Microsoft YaHei"/>
           <w:b/>
-          <w:color w:val="475569"/>
-          <w:sz w:val="22"/>
+          <w:color w:val="595959"/>
+          <w:sz w:val="24"/>
+        </w:rPr>
+      </w:r>
+      <w:r>
+        <w:rPr>
+          <w:rFonts w:ascii="Microsoft YaHei" w:hAnsi="Microsoft YaHei"/>
+          <w:b/>
+          <w:color w:val="595959"/>
+          <w:sz w:val="24"/>
         </w:rPr>
         <w:t>2. 成长期（用户数 5,000 - 50,000）</w:t>
       </w:r>
@@ -301,79 +561,145 @@
     <w:p>
       <w:pPr>
         <w:pStyle w:val="ListBullet"/>
+        <w:spacing w:after="60"/>
       </w:pPr>
       <w:r>
         <w:rPr>
           <w:rFonts w:ascii="Microsoft YaHei" w:hAnsi="Microsoft YaHei"/>
         </w:rPr>
-        <w:t xml:space="preserve">  食刻集市 (UGC 创作者分成)：</w:t>
+      </w:r>
+      <w:r>
+        <w:rPr>
+          <w:rFonts w:ascii="Microsoft YaHei" w:hAnsi="Microsoft YaHei"/>
+          <w:b/>
+        </w:rPr>
+        <w:t>食刻集市 (UGC 创作者分成)</w:t>
+      </w:r>
+      <w:r>
+        <w:rPr>
+          <w:rFonts w:ascii="Microsoft YaHei" w:hAnsi="Microsoft YaHei"/>
+        </w:rPr>
+        <w:t>：</w:t>
       </w:r>
     </w:p>
     <w:p>
       <w:pPr>
         <w:pStyle w:val="ListBullet"/>
+        <w:spacing w:after="60"/>
       </w:pPr>
       <w:r>
         <w:rPr>
           <w:rFonts w:ascii="Microsoft YaHei" w:hAnsi="Microsoft YaHei"/>
         </w:rPr>
-        <w:t xml:space="preserve">  允许专业健身教练、减脂博主或营养师入驻。</w:t>
+        <w:t>允许专业健身教练、减脂博主或营养师入驻。</w:t>
       </w:r>
     </w:p>
     <w:p>
       <w:pPr>
         <w:pStyle w:val="ListBullet"/>
+        <w:spacing w:after="60"/>
       </w:pPr>
       <w:r>
         <w:rPr>
           <w:rFonts w:ascii="Microsoft YaHei" w:hAnsi="Microsoft YaHei"/>
         </w:rPr>
-        <w:t xml:space="preserve">  发布付费内容（如：“7天生酮食谱计划”，售价 9.9 元 - 49 元）。</w:t>
+        <w:t>发布付费内容（如：`“7天生酮食谱计划”`，售价 9.9 元 - 49 元）。</w:t>
       </w:r>
     </w:p>
     <w:p>
       <w:pPr>
         <w:pStyle w:val="ListBullet"/>
+        <w:spacing w:after="60"/>
       </w:pPr>
       <w:r>
         <w:rPr>
           <w:rFonts w:ascii="Microsoft YaHei" w:hAnsi="Microsoft YaHei"/>
         </w:rPr>
-        <w:t xml:space="preserve">  平台提取 20% 交易佣金（对标知识星球模式）。</w:t>
+        <w:t xml:space="preserve">平台提取 </w:t>
+      </w:r>
+      <w:r>
+        <w:rPr>
+          <w:rFonts w:ascii="Microsoft YaHei" w:hAnsi="Microsoft YaHei"/>
+          <w:b/>
+        </w:rPr>
+        <w:t>20%</w:t>
+      </w:r>
+      <w:r>
+        <w:rPr>
+          <w:rFonts w:ascii="Microsoft YaHei" w:hAnsi="Microsoft YaHei"/>
+        </w:rPr>
+        <w:t xml:space="preserve"> 交易佣金（对标知识星球模式）。</w:t>
       </w:r>
     </w:p>
     <w:p>
       <w:pPr>
         <w:pStyle w:val="ListBullet"/>
+        <w:spacing w:after="60"/>
       </w:pPr>
       <w:r>
         <w:rPr>
           <w:rFonts w:ascii="Microsoft YaHei" w:hAnsi="Microsoft YaHei"/>
         </w:rPr>
-        <w:t xml:space="preserve">  官方对赌赛事资金流：</w:t>
+      </w:r>
+      <w:r>
+        <w:rPr>
+          <w:rFonts w:ascii="Microsoft YaHei" w:hAnsi="Microsoft YaHei"/>
+          <w:b/>
+        </w:rPr>
+        <w:t>官方对赌赛事资金流</w:t>
+      </w:r>
+      <w:r>
+        <w:rPr>
+          <w:rFonts w:ascii="Microsoft YaHei" w:hAnsi="Microsoft YaHei"/>
+        </w:rPr>
+        <w:t>：</w:t>
       </w:r>
     </w:p>
     <w:p>
       <w:pPr>
         <w:pStyle w:val="ListBullet"/>
+        <w:spacing w:after="60"/>
       </w:pPr>
       <w:r>
         <w:rPr>
           <w:rFonts w:ascii="Microsoft YaHei" w:hAnsi="Microsoft YaHei"/>
         </w:rPr>
-        <w:t xml:space="preserve">  提供官方组队的“百人减脂争霸赛”。用户缴纳真实押金（如 20 元），未达标者资金沉淀，达标者瓜分资金池，平台从沉淀资金中抽取 10% 作为运营技术服务费。</w:t>
+        <w:t xml:space="preserve">提供官方组队的“百人减脂争霸赛”。用户缴纳真实押金（如 20 元），未达标者资金沉淀，达标者瓜分资金池，平台从沉淀资金中抽取 </w:t>
+      </w:r>
+      <w:r>
+        <w:rPr>
+          <w:rFonts w:ascii="Microsoft YaHei" w:hAnsi="Microsoft YaHei"/>
+          <w:b/>
+        </w:rPr>
+        <w:t>10%</w:t>
+      </w:r>
+      <w:r>
+        <w:rPr>
+          <w:rFonts w:ascii="Microsoft YaHei" w:hAnsi="Microsoft YaHei"/>
+        </w:rPr>
+        <w:t xml:space="preserve"> 作为运营技术服务费。</w:t>
       </w:r>
     </w:p>
     <w:p>
       <w:pPr>
         <w:pStyle w:val="Heading4"/>
+        <w:keepNext/>
+        <w:spacing w:before="240" w:after="120"/>
       </w:pPr>
       <w:r>
         <w:rPr>
           <w:rFonts w:ascii="Microsoft YaHei" w:hAnsi="Microsoft YaHei"/>
           <w:b/>
-          <w:color w:val="475569"/>
-          <w:sz w:val="22"/>
+          <w:color w:val="595959"/>
+          <w:sz w:val="24"/>
+        </w:rPr>
+      </w:r>
+      <w:r>
+        <w:rPr>
+          <w:rFonts w:ascii="Microsoft YaHei" w:hAnsi="Microsoft YaHei"/>
+          <w:b/>
+          <w:color w:val="595959"/>
+          <w:sz w:val="24"/>
         </w:rPr>
         <w:t>3. 成熟期（用户数 50,000+）</w:t>
       </w:r>
@@ -381,61 +707,90 @@
     <w:p>
       <w:pPr>
         <w:pStyle w:val="ListBullet"/>
+        <w:spacing w:after="60"/>
       </w:pPr>
       <w:r>
         <w:rPr>
           <w:rFonts w:ascii="Microsoft YaHei" w:hAnsi="Microsoft YaHei"/>
         </w:rPr>
-        <w:t xml:space="preserve">  食刻 Pro (订阅会员)：</w:t>
+      </w:r>
+      <w:r>
+        <w:rPr>
+          <w:rFonts w:ascii="Microsoft YaHei" w:hAnsi="Microsoft YaHei"/>
+          <w:b/>
+        </w:rPr>
+        <w:t>食刻 Pro (订阅会员)</w:t>
+      </w:r>
+      <w:r>
+        <w:rPr>
+          <w:rFonts w:ascii="Microsoft YaHei" w:hAnsi="Microsoft YaHei"/>
+        </w:rPr>
+        <w:t>：</w:t>
       </w:r>
     </w:p>
     <w:p>
       <w:pPr>
         <w:pStyle w:val="ListBullet"/>
+        <w:spacing w:after="60"/>
       </w:pPr>
       <w:r>
         <w:rPr>
           <w:rFonts w:ascii="Microsoft YaHei" w:hAnsi="Microsoft YaHei"/>
         </w:rPr>
-        <w:t xml:space="preserve">  价格：15~28 元/月。</w:t>
+        <w:t>*价格*：15~28 元/月。</w:t>
       </w:r>
     </w:p>
     <w:p>
       <w:pPr>
         <w:pStyle w:val="ListBullet"/>
+        <w:spacing w:after="60"/>
       </w:pPr>
       <w:r>
         <w:rPr>
           <w:rFonts w:ascii="Microsoft YaHei" w:hAnsi="Microsoft YaHei"/>
         </w:rPr>
-        <w:t xml:space="preserve">  专属功能：AI 个人营养医生周报（通过大模型深度分析一周饮食盲区并给出调理建议）、定制化 AI 食谱生成。</w:t>
+        <w:t>*专属功能*：AI 个人营养医生周报（通过大模型深度分析一周饮食盲区并给出调理建议）、定制化 AI 食谱生成。</w:t>
       </w:r>
     </w:p>
     <w:p>
       <w:pPr>
         <w:pStyle w:val="ListBullet"/>
+        <w:spacing w:after="60"/>
       </w:pPr>
       <w:r>
         <w:rPr>
           <w:rFonts w:ascii="Microsoft YaHei" w:hAnsi="Microsoft YaHei"/>
         </w:rPr>
-        <w:t xml:space="preserve">  原生品牌健康食品合作 (非弹窗广告)：</w:t>
+      </w:r>
+      <w:r>
+        <w:rPr>
+          <w:rFonts w:ascii="Microsoft YaHei" w:hAnsi="Microsoft YaHei"/>
+          <w:b/>
+        </w:rPr>
+        <w:t>原生品牌健康食品合作 (非弹窗广告)</w:t>
+      </w:r>
+      <w:r>
+        <w:rPr>
+          <w:rFonts w:ascii="Microsoft YaHei" w:hAnsi="Microsoft YaHei"/>
+        </w:rPr>
+        <w:t>：</w:t>
       </w:r>
     </w:p>
     <w:p>
       <w:pPr>
         <w:pStyle w:val="ListBullet"/>
+        <w:spacing w:after="60"/>
       </w:pPr>
       <w:r>
         <w:rPr>
           <w:rFonts w:ascii="Microsoft YaHei" w:hAnsi="Microsoft YaHei"/>
         </w:rPr>
-        <w:t xml:space="preserve">  与轻食沙拉、高蛋白零食、智能体脂秤品牌进行深度原生内容合作。例如，AI 分析今日用户蛋白质摄入量不足时，会在分析卡片底部自然推荐：“您可以搭配一包【XX品牌】即食鸡胸肉，快速补充蛋白质”。</w:t>
+        <w:t>与轻食沙拉、高蛋白零食、智能体脂秤品牌进行深度原生内容合作。例如，AI 分析今日用户蛋白质摄入量不足时，会在分析卡片底部自然推荐：“您可以搭配一包【XX品牌】即食鸡胸肉，快速补充蛋白质”。</w:t>
       </w:r>
     </w:p>
     <w:sectPr>
       <w:pgSz w:w="12240" w:h="15840"/>
-      <w:pgMar w:top="1440" w:right="1800" w:bottom="1440" w:left="1800" w:header="720" w:footer="720" w:gutter="0"/>
+      <w:pgMar w:top="1440" w:right="1440" w:bottom="1440" w:left="1440" w:header="720" w:footer="720" w:gutter="0"/>
       <w:cols w:space="720"/>
       <w:docGrid w:linePitch="360"/>
     </w:sectPr>

</xml_diff>